<commit_message>
feat(data): add missing-data interpolation engine
</commit_message>
<xml_diff>
--- a/docs/Sprint_2.docx
+++ b/docs/Sprint_2.docx
@@ -1565,6 +1565,334 @@
         <w:t>Date range...............2002-2024</w:t>
       </w:r>
     </w:p>
+    <w:p>
+      <w:pPr>
+        <w:spacing w:after="0" w:line="240" w:lineRule="auto"/>
+        <w:rPr>
+          <w:noProof/>
+          <w:sz w:val="32"/>
+          <w:szCs w:val="32"/>
+        </w:rPr>
+      </w:pPr>
+    </w:p>
+    <w:p>
+      <w:pPr>
+        <w:spacing w:after="0" w:line="240" w:lineRule="auto"/>
+        <w:rPr>
+          <w:noProof/>
+          <w:sz w:val="32"/>
+          <w:szCs w:val="32"/>
+        </w:rPr>
+      </w:pPr>
+    </w:p>
+    <w:p>
+      <w:pPr>
+        <w:spacing w:after="0" w:line="240" w:lineRule="auto"/>
+        <w:rPr>
+          <w:b/>
+          <w:bCs/>
+          <w:noProof/>
+          <w:sz w:val="32"/>
+          <w:szCs w:val="32"/>
+          <w:u w:val="single"/>
+          <w:lang w:val="tr-TR"/>
+        </w:rPr>
+      </w:pPr>
+      <w:r>
+        <w:rPr>
+          <w:b/>
+          <w:bCs/>
+          <w:noProof/>
+          <w:sz w:val="32"/>
+          <w:szCs w:val="32"/>
+          <w:u w:val="single"/>
+          <w:lang w:val="tr-TR"/>
+        </w:rPr>
+        <w:t>Here's the revised Sprint 2 roadmap:</w:t>
+      </w:r>
+    </w:p>
+    <w:p>
+      <w:pPr>
+        <w:numPr>
+          <w:ilvl w:val="0"/>
+          <w:numId w:val="1"/>
+        </w:numPr>
+        <w:spacing w:after="0" w:line="240" w:lineRule="auto"/>
+        <w:rPr>
+          <w:noProof/>
+          <w:sz w:val="32"/>
+          <w:szCs w:val="32"/>
+          <w:lang w:val="tr-TR"/>
+        </w:rPr>
+      </w:pPr>
+      <w:r>
+        <w:rPr>
+          <w:rFonts w:ascii="Segoe UI Emoji" w:hAnsi="Segoe UI Emoji" w:cs="Segoe UI Emoji"/>
+          <w:noProof/>
+          <w:sz w:val="32"/>
+          <w:szCs w:val="32"/>
+          <w:lang w:val="tr-TR"/>
+        </w:rPr>
+        <w:t>✅</w:t>
+      </w:r>
+      <w:r>
+        <w:rPr>
+          <w:noProof/>
+          <w:sz w:val="32"/>
+          <w:szCs w:val="32"/>
+          <w:lang w:val="tr-TR"/>
+        </w:rPr>
+        <w:t xml:space="preserve"> Commit 1 – Dataset container </w:t>
+      </w:r>
+    </w:p>
+    <w:p>
+      <w:pPr>
+        <w:numPr>
+          <w:ilvl w:val="0"/>
+          <w:numId w:val="1"/>
+        </w:numPr>
+        <w:spacing w:after="0" w:line="240" w:lineRule="auto"/>
+        <w:rPr>
+          <w:noProof/>
+          <w:sz w:val="32"/>
+          <w:szCs w:val="32"/>
+          <w:lang w:val="tr-TR"/>
+        </w:rPr>
+      </w:pPr>
+      <w:r>
+        <w:rPr>
+          <w:rFonts w:ascii="Segoe UI Emoji" w:hAnsi="Segoe UI Emoji" w:cs="Segoe UI Emoji"/>
+          <w:noProof/>
+          <w:sz w:val="32"/>
+          <w:szCs w:val="32"/>
+          <w:lang w:val="tr-TR"/>
+        </w:rPr>
+        <w:t>✅</w:t>
+      </w:r>
+      <w:r>
+        <w:rPr>
+          <w:noProof/>
+          <w:sz w:val="32"/>
+          <w:szCs w:val="32"/>
+          <w:lang w:val="tr-TR"/>
+        </w:rPr>
+        <w:t xml:space="preserve"> Commit 2 – CSV loader </w:t>
+      </w:r>
+    </w:p>
+    <w:p>
+      <w:pPr>
+        <w:numPr>
+          <w:ilvl w:val="0"/>
+          <w:numId w:val="1"/>
+        </w:numPr>
+        <w:spacing w:after="0" w:line="240" w:lineRule="auto"/>
+        <w:rPr>
+          <w:noProof/>
+          <w:sz w:val="32"/>
+          <w:szCs w:val="32"/>
+          <w:lang w:val="tr-TR"/>
+        </w:rPr>
+      </w:pPr>
+      <w:r>
+        <w:rPr>
+          <w:rFonts w:ascii="Segoe UI Emoji" w:hAnsi="Segoe UI Emoji" w:cs="Segoe UI Emoji"/>
+          <w:noProof/>
+          <w:sz w:val="32"/>
+          <w:szCs w:val="32"/>
+          <w:lang w:val="tr-TR"/>
+        </w:rPr>
+        <w:t>✅</w:t>
+      </w:r>
+      <w:r>
+        <w:rPr>
+          <w:noProof/>
+          <w:sz w:val="32"/>
+          <w:szCs w:val="32"/>
+          <w:lang w:val="tr-TR"/>
+        </w:rPr>
+        <w:t xml:space="preserve"> Commit 3 – Validation engine </w:t>
+      </w:r>
+    </w:p>
+    <w:p>
+      <w:pPr>
+        <w:numPr>
+          <w:ilvl w:val="0"/>
+          <w:numId w:val="1"/>
+        </w:numPr>
+        <w:spacing w:after="0" w:line="240" w:lineRule="auto"/>
+        <w:rPr>
+          <w:noProof/>
+          <w:sz w:val="32"/>
+          <w:szCs w:val="32"/>
+          <w:lang w:val="tr-TR"/>
+        </w:rPr>
+      </w:pPr>
+      <w:r>
+        <w:rPr>
+          <w:rFonts w:ascii="Segoe UI Emoji" w:hAnsi="Segoe UI Emoji" w:cs="Segoe UI Emoji"/>
+          <w:noProof/>
+          <w:sz w:val="32"/>
+          <w:szCs w:val="32"/>
+          <w:lang w:val="tr-TR"/>
+        </w:rPr>
+        <w:t>🔄</w:t>
+      </w:r>
+      <w:r>
+        <w:rPr>
+          <w:noProof/>
+          <w:sz w:val="32"/>
+          <w:szCs w:val="32"/>
+          <w:lang w:val="tr-TR"/>
+        </w:rPr>
+        <w:t xml:space="preserve"> Commit 4 – Missing-data engine (linear, forward-fill, backward-fill) </w:t>
+      </w:r>
+    </w:p>
+    <w:p>
+      <w:pPr>
+        <w:numPr>
+          <w:ilvl w:val="0"/>
+          <w:numId w:val="1"/>
+        </w:numPr>
+        <w:spacing w:after="0" w:line="240" w:lineRule="auto"/>
+        <w:rPr>
+          <w:noProof/>
+          <w:sz w:val="32"/>
+          <w:szCs w:val="32"/>
+          <w:lang w:val="tr-TR"/>
+        </w:rPr>
+      </w:pPr>
+      <w:r>
+        <w:rPr>
+          <w:rFonts w:ascii="Segoe UI Emoji" w:hAnsi="Segoe UI Emoji" w:cs="Segoe UI Emoji"/>
+          <w:noProof/>
+          <w:sz w:val="32"/>
+          <w:szCs w:val="32"/>
+          <w:lang w:val="tr-TR"/>
+        </w:rPr>
+        <w:t>⏳</w:t>
+      </w:r>
+      <w:r>
+        <w:rPr>
+          <w:noProof/>
+          <w:sz w:val="32"/>
+          <w:szCs w:val="32"/>
+          <w:lang w:val="tr-TR"/>
+        </w:rPr>
+        <w:t xml:space="preserve"> Commit 5 – Automatic quarterly index detection </w:t>
+      </w:r>
+    </w:p>
+    <w:p>
+      <w:pPr>
+        <w:numPr>
+          <w:ilvl w:val="0"/>
+          <w:numId w:val="1"/>
+        </w:numPr>
+        <w:spacing w:after="0" w:line="240" w:lineRule="auto"/>
+        <w:rPr>
+          <w:noProof/>
+          <w:sz w:val="32"/>
+          <w:szCs w:val="32"/>
+          <w:lang w:val="tr-TR"/>
+        </w:rPr>
+      </w:pPr>
+      <w:r>
+        <w:rPr>
+          <w:rFonts w:ascii="Segoe UI Emoji" w:hAnsi="Segoe UI Emoji" w:cs="Segoe UI Emoji"/>
+          <w:noProof/>
+          <w:sz w:val="32"/>
+          <w:szCs w:val="32"/>
+          <w:lang w:val="tr-TR"/>
+        </w:rPr>
+        <w:t>⏳</w:t>
+      </w:r>
+      <w:r>
+        <w:rPr>
+          <w:noProof/>
+          <w:sz w:val="32"/>
+          <w:szCs w:val="32"/>
+          <w:lang w:val="tr-TR"/>
+        </w:rPr>
+        <w:t xml:space="preserve"> Commit 6 – Missing-quarter detection </w:t>
+      </w:r>
+    </w:p>
+    <w:p>
+      <w:pPr>
+        <w:numPr>
+          <w:ilvl w:val="0"/>
+          <w:numId w:val="1"/>
+        </w:numPr>
+        <w:spacing w:after="0" w:line="240" w:lineRule="auto"/>
+        <w:rPr>
+          <w:noProof/>
+          <w:sz w:val="32"/>
+          <w:szCs w:val="32"/>
+          <w:lang w:val="tr-TR"/>
+        </w:rPr>
+      </w:pPr>
+      <w:r>
+        <w:rPr>
+          <w:rFonts w:ascii="Segoe UI Emoji" w:hAnsi="Segoe UI Emoji" w:cs="Segoe UI Emoji"/>
+          <w:noProof/>
+          <w:sz w:val="32"/>
+          <w:szCs w:val="32"/>
+          <w:lang w:val="tr-TR"/>
+        </w:rPr>
+        <w:t>⏳</w:t>
+      </w:r>
+      <w:r>
+        <w:rPr>
+          <w:noProof/>
+          <w:sz w:val="32"/>
+          <w:szCs w:val="32"/>
+          <w:lang w:val="tr-TR"/>
+        </w:rPr>
+        <w:t xml:space="preserve"> Commit 7 – Gap interpolation with reporting </w:t>
+      </w:r>
+    </w:p>
+    <w:p>
+      <w:pPr>
+        <w:numPr>
+          <w:ilvl w:val="0"/>
+          <w:numId w:val="1"/>
+        </w:numPr>
+        <w:spacing w:after="0" w:line="240" w:lineRule="auto"/>
+        <w:rPr>
+          <w:noProof/>
+          <w:sz w:val="32"/>
+          <w:szCs w:val="32"/>
+          <w:lang w:val="tr-TR"/>
+        </w:rPr>
+      </w:pPr>
+      <w:r>
+        <w:rPr>
+          <w:rFonts w:ascii="Segoe UI Emoji" w:hAnsi="Segoe UI Emoji" w:cs="Segoe UI Emoji"/>
+          <w:noProof/>
+          <w:sz w:val="32"/>
+          <w:szCs w:val="32"/>
+          <w:lang w:val="tr-TR"/>
+        </w:rPr>
+        <w:t>⏳</w:t>
+      </w:r>
+      <w:r>
+        <w:rPr>
+          <w:noProof/>
+          <w:sz w:val="32"/>
+          <w:szCs w:val="32"/>
+          <w:lang w:val="tr-TR"/>
+        </w:rPr>
+        <w:t xml:space="preserve"> Commit 8 – Dataset diagnostics report</w:t>
+      </w:r>
+    </w:p>
+    <w:p>
+      <w:pPr>
+        <w:spacing w:after="0" w:line="240" w:lineRule="auto"/>
+        <w:rPr>
+          <w:noProof/>
+          <w:sz w:val="32"/>
+          <w:szCs w:val="32"/>
+        </w:rPr>
+      </w:pPr>
+    </w:p>
     <w:sectPr>
       <w:pgSz w:w="11906" w:h="16838"/>
       <w:pgMar w:top="1417" w:right="1417" w:bottom="1417" w:left="1417" w:header="708" w:footer="708" w:gutter="0"/>
@@ -1573,6 +1901,163 @@
     </w:sectPr>
   </w:body>
 </w:document>
+</file>
+
+<file path=word/numbering.xml><?xml version="1.0" encoding="utf-8"?>
+<w:numbering xmlns:wpc="http://schemas.microsoft.com/office/word/2010/wordprocessingCanvas" xmlns:cx="http://schemas.microsoft.com/office/drawing/2014/chartex" xmlns:cx1="http://schemas.microsoft.com/office/drawing/2015/9/8/chartex" xmlns:cx2="http://schemas.microsoft.com/office/drawing/2015/10/21/chartex" xmlns:cx3="http://schemas.microsoft.com/office/drawing/2016/5/9/chartex" xmlns:cx4="http://schemas.microsoft.com/office/drawing/2016/5/10/chartex" xmlns:cx5="http://schemas.microsoft.com/office/drawing/2016/5/11/chartex" xmlns:cx6="http://schemas.microsoft.com/office/drawing/2016/5/12/chartex" xmlns:cx7="http://schemas.microsoft.com/office/drawing/2016/5/13/chartex" xmlns:cx8="http://schemas.microsoft.com/office/drawing/2016/5/14/chartex" xmlns:mc="http://schemas.openxmlformats.org/markup-compatibility/2006" xmlns:aink="http://schemas.microsoft.com/office/drawing/2016/ink" xmlns:am3d="http://schemas.microsoft.com/office/drawing/2017/model3d" xmlns:o="urn:schemas-microsoft-com:office:office" xmlns:oel="http://schemas.microsoft.com/office/2019/extlst" xmlns:r="http://schemas.openxmlformats.org/officeDocument/2006/relationships" xmlns:m="http://schemas.openxmlformats.org/officeDocument/2006/math" xmlns:v="urn:schemas-microsoft-com:vml" xmlns:wp14="http://schemas.microsoft.com/office/word/2010/wordprocessingDrawing" xmlns:wp="http://schemas.openxmlformats.org/drawingml/2006/wordprocessingDrawing" xmlns:w10="urn:schemas-microsoft-com:office:word" xmlns:w="http://schemas.openxmlformats.org/wordprocessingml/2006/main" xmlns:w14="http://schemas.microsoft.com/office/word/2010/wordml" xmlns:w15="http://schemas.microsoft.com/office/word/2012/wordml" xmlns:w16cex="http://schemas.microsoft.com/office/word/2018/wordml/cex" xmlns:w16cid="http://schemas.microsoft.com/office/word/2016/wordml/cid" xmlns:w16="http://schemas.microsoft.com/office/word/2018/wordml" xmlns:w16du="http://schemas.microsoft.com/office/word/2023/wordml/word16du" xmlns:w16sdtdh="http://schemas.microsoft.com/office/word/2020/wordml/sdtdatahash" xmlns:w16sdtfl="http://schemas.microsoft.com/office/word/2024/wordml/sdtformatlock" xmlns:w16se="http://schemas.microsoft.com/office/word/2015/wordml/symex" xmlns:wpg="http://schemas.microsoft.com/office/word/2010/wordprocessingGroup" xmlns:wpi="http://schemas.microsoft.com/office/word/2010/wordprocessingInk" xmlns:wne="http://schemas.microsoft.com/office/word/2006/wordml" xmlns:wps="http://schemas.microsoft.com/office/word/2010/wordprocessingShape" mc:Ignorable="w14 w15 w16se w16cid w16 w16cex w16sdtdh w16sdtfl w16du wp14">
+  <w:abstractNum w:abstractNumId="0" w15:restartNumberingAfterBreak="0">
+    <w:nsid w:val="7C436FBC"/>
+    <w:multiLevelType w:val="multilevel"/>
+    <w:tmpl w:val="A09E5DA0"/>
+    <w:lvl w:ilvl="0">
+      <w:start w:val="1"/>
+      <w:numFmt w:val="bullet"/>
+      <w:lvlText w:val=""/>
+      <w:lvlJc w:val="left"/>
+      <w:pPr>
+        <w:tabs>
+          <w:tab w:val="num" w:pos="720"/>
+        </w:tabs>
+        <w:ind w:left="720" w:hanging="360"/>
+      </w:pPr>
+      <w:rPr>
+        <w:rFonts w:ascii="Symbol" w:hAnsi="Symbol" w:hint="default"/>
+        <w:sz w:val="20"/>
+      </w:rPr>
+    </w:lvl>
+    <w:lvl w:ilvl="1" w:tentative="1">
+      <w:start w:val="1"/>
+      <w:numFmt w:val="bullet"/>
+      <w:lvlText w:val="o"/>
+      <w:lvlJc w:val="left"/>
+      <w:pPr>
+        <w:tabs>
+          <w:tab w:val="num" w:pos="1440"/>
+        </w:tabs>
+        <w:ind w:left="1440" w:hanging="360"/>
+      </w:pPr>
+      <w:rPr>
+        <w:rFonts w:ascii="Courier New" w:hAnsi="Courier New" w:hint="default"/>
+        <w:sz w:val="20"/>
+      </w:rPr>
+    </w:lvl>
+    <w:lvl w:ilvl="2" w:tentative="1">
+      <w:start w:val="1"/>
+      <w:numFmt w:val="bullet"/>
+      <w:lvlText w:val=""/>
+      <w:lvlJc w:val="left"/>
+      <w:pPr>
+        <w:tabs>
+          <w:tab w:val="num" w:pos="2160"/>
+        </w:tabs>
+        <w:ind w:left="2160" w:hanging="360"/>
+      </w:pPr>
+      <w:rPr>
+        <w:rFonts w:ascii="Wingdings" w:hAnsi="Wingdings" w:hint="default"/>
+        <w:sz w:val="20"/>
+      </w:rPr>
+    </w:lvl>
+    <w:lvl w:ilvl="3" w:tentative="1">
+      <w:start w:val="1"/>
+      <w:numFmt w:val="bullet"/>
+      <w:lvlText w:val=""/>
+      <w:lvlJc w:val="left"/>
+      <w:pPr>
+        <w:tabs>
+          <w:tab w:val="num" w:pos="2880"/>
+        </w:tabs>
+        <w:ind w:left="2880" w:hanging="360"/>
+      </w:pPr>
+      <w:rPr>
+        <w:rFonts w:ascii="Wingdings" w:hAnsi="Wingdings" w:hint="default"/>
+        <w:sz w:val="20"/>
+      </w:rPr>
+    </w:lvl>
+    <w:lvl w:ilvl="4" w:tentative="1">
+      <w:start w:val="1"/>
+      <w:numFmt w:val="bullet"/>
+      <w:lvlText w:val=""/>
+      <w:lvlJc w:val="left"/>
+      <w:pPr>
+        <w:tabs>
+          <w:tab w:val="num" w:pos="3600"/>
+        </w:tabs>
+        <w:ind w:left="3600" w:hanging="360"/>
+      </w:pPr>
+      <w:rPr>
+        <w:rFonts w:ascii="Wingdings" w:hAnsi="Wingdings" w:hint="default"/>
+        <w:sz w:val="20"/>
+      </w:rPr>
+    </w:lvl>
+    <w:lvl w:ilvl="5" w:tentative="1">
+      <w:start w:val="1"/>
+      <w:numFmt w:val="bullet"/>
+      <w:lvlText w:val=""/>
+      <w:lvlJc w:val="left"/>
+      <w:pPr>
+        <w:tabs>
+          <w:tab w:val="num" w:pos="4320"/>
+        </w:tabs>
+        <w:ind w:left="4320" w:hanging="360"/>
+      </w:pPr>
+      <w:rPr>
+        <w:rFonts w:ascii="Wingdings" w:hAnsi="Wingdings" w:hint="default"/>
+        <w:sz w:val="20"/>
+      </w:rPr>
+    </w:lvl>
+    <w:lvl w:ilvl="6" w:tentative="1">
+      <w:start w:val="1"/>
+      <w:numFmt w:val="bullet"/>
+      <w:lvlText w:val=""/>
+      <w:lvlJc w:val="left"/>
+      <w:pPr>
+        <w:tabs>
+          <w:tab w:val="num" w:pos="5040"/>
+        </w:tabs>
+        <w:ind w:left="5040" w:hanging="360"/>
+      </w:pPr>
+      <w:rPr>
+        <w:rFonts w:ascii="Wingdings" w:hAnsi="Wingdings" w:hint="default"/>
+        <w:sz w:val="20"/>
+      </w:rPr>
+    </w:lvl>
+    <w:lvl w:ilvl="7" w:tentative="1">
+      <w:start w:val="1"/>
+      <w:numFmt w:val="bullet"/>
+      <w:lvlText w:val=""/>
+      <w:lvlJc w:val="left"/>
+      <w:pPr>
+        <w:tabs>
+          <w:tab w:val="num" w:pos="5760"/>
+        </w:tabs>
+        <w:ind w:left="5760" w:hanging="360"/>
+      </w:pPr>
+      <w:rPr>
+        <w:rFonts w:ascii="Wingdings" w:hAnsi="Wingdings" w:hint="default"/>
+        <w:sz w:val="20"/>
+      </w:rPr>
+    </w:lvl>
+    <w:lvl w:ilvl="8" w:tentative="1">
+      <w:start w:val="1"/>
+      <w:numFmt w:val="bullet"/>
+      <w:lvlText w:val=""/>
+      <w:lvlJc w:val="left"/>
+      <w:pPr>
+        <w:tabs>
+          <w:tab w:val="num" w:pos="6480"/>
+        </w:tabs>
+        <w:ind w:left="6480" w:hanging="360"/>
+      </w:pPr>
+      <w:rPr>
+        <w:rFonts w:ascii="Wingdings" w:hAnsi="Wingdings" w:hint="default"/>
+        <w:sz w:val="20"/>
+      </w:rPr>
+    </w:lvl>
+  </w:abstractNum>
+  <w:num w:numId="1" w16cid:durableId="384915216">
+    <w:abstractNumId w:val="0"/>
+  </w:num>
+</w:numbering>
 </file>
 
 <file path=word/styles.xml><?xml version="1.0" encoding="utf-8"?>

</xml_diff>

<commit_message>
feat(data): detect dataset sampling frequency
</commit_message>
<xml_diff>
--- a/docs/Sprint_2.docx
+++ b/docs/Sprint_2.docx
@@ -1735,7 +1735,7 @@
           <w:szCs w:val="32"/>
           <w:lang w:val="tr-TR"/>
         </w:rPr>
-        <w:t>🔄</w:t>
+        <w:t xml:space="preserve">✅ </w:t>
       </w:r>
       <w:r>
         <w:rPr>
@@ -1744,7 +1744,53 @@
           <w:szCs w:val="32"/>
           <w:lang w:val="tr-TR"/>
         </w:rPr>
-        <w:t xml:space="preserve"> Commit 4 – Missing-data engine (linear, forward-fill, backward-fill) </w:t>
+        <w:t xml:space="preserve">Commit </w:t>
+      </w:r>
+      <w:r>
+        <w:rPr>
+          <w:noProof/>
+          <w:sz w:val="32"/>
+          <w:szCs w:val="32"/>
+          <w:lang w:val="tr-TR"/>
+        </w:rPr>
+        <w:t>4</w:t>
+      </w:r>
+      <w:r>
+        <w:rPr>
+          <w:noProof/>
+          <w:sz w:val="32"/>
+          <w:szCs w:val="32"/>
+          <w:lang w:val="tr-TR"/>
+        </w:rPr>
+        <w:t xml:space="preserve"> – </w:t>
+      </w:r>
+      <w:r>
+        <w:rPr>
+          <w:noProof/>
+          <w:sz w:val="32"/>
+          <w:szCs w:val="32"/>
+          <w:lang w:val="tr-TR"/>
+        </w:rPr>
+        <w:t>Missing-data interpolation engine</w:t>
+      </w:r>
+      <w:r>
+        <w:rPr>
+          <w:rFonts w:ascii="Segoe UI Emoji" w:hAnsi="Segoe UI Emoji" w:cs="Segoe UI Emoji"/>
+          <w:noProof/>
+          <w:sz w:val="32"/>
+          <w:szCs w:val="32"/>
+          <w:lang w:val="tr-TR"/>
+        </w:rPr>
+        <w:t xml:space="preserve"> </w:t>
+      </w:r>
+      <w:r>
+        <w:rPr>
+          <w:noProof/>
+          <w:sz w:val="32"/>
+          <w:szCs w:val="32"/>
+          <w:lang w:val="tr-TR"/>
+        </w:rPr>
+        <w:t xml:space="preserve">(linear, forward-fill, backward-fill) </w:t>
       </w:r>
     </w:p>
     <w:p>

</xml_diff>

<commit_message>
feat(data): add resampling engine
</commit_message>
<xml_diff>
--- a/docs/Sprint_2.docx
+++ b/docs/Sprint_2.docx
@@ -1928,6 +1928,913 @@
         </w:rPr>
         <w:t xml:space="preserve"> Commit 8 – Dataset diagnostics report</w:t>
       </w:r>
+    </w:p>
+    <w:p>
+      <w:pPr>
+        <w:spacing w:after="0" w:line="240" w:lineRule="auto"/>
+        <w:ind w:left="360"/>
+        <w:rPr>
+          <w:noProof/>
+          <w:sz w:val="32"/>
+          <w:szCs w:val="32"/>
+          <w:lang w:val="tr-TR"/>
+        </w:rPr>
+      </w:pPr>
+    </w:p>
+    <w:p>
+      <w:pPr>
+        <w:rPr>
+          <w:noProof/>
+          <w:sz w:val="32"/>
+          <w:szCs w:val="32"/>
+          <w:lang w:val="tr-TR"/>
+        </w:rPr>
+      </w:pPr>
+      <w:r>
+        <w:rPr>
+          <w:noProof/>
+          <w:sz w:val="32"/>
+          <w:szCs w:val="32"/>
+          <w:lang w:val="tr-TR"/>
+        </w:rPr>
+        <w:br w:type="page"/>
+      </w:r>
+    </w:p>
+    <w:p>
+      <w:pPr>
+        <w:spacing w:after="0" w:line="240" w:lineRule="auto"/>
+        <w:ind w:left="360"/>
+        <w:rPr>
+          <w:noProof/>
+          <w:sz w:val="32"/>
+          <w:szCs w:val="32"/>
+          <w:lang w:val="tr-TR"/>
+        </w:rPr>
+      </w:pPr>
+    </w:p>
+    <w:p>
+      <w:pPr>
+        <w:spacing w:after="0" w:line="240" w:lineRule="auto"/>
+        <w:ind w:left="360"/>
+        <w:rPr>
+          <w:noProof/>
+          <w:sz w:val="32"/>
+          <w:szCs w:val="32"/>
+          <w:lang w:val="tr-TR"/>
+        </w:rPr>
+      </w:pPr>
+    </w:p>
+    <w:tbl>
+      <w:tblPr>
+        <w:tblW w:w="0" w:type="auto"/>
+        <w:tblCellSpacing w:w="15" w:type="dxa"/>
+        <w:tblCellMar>
+          <w:top w:w="15" w:type="dxa"/>
+          <w:left w:w="15" w:type="dxa"/>
+          <w:bottom w:w="15" w:type="dxa"/>
+          <w:right w:w="15" w:type="dxa"/>
+        </w:tblCellMar>
+        <w:tblLook w:val="04A0" w:firstRow="1" w:lastRow="0" w:firstColumn="1" w:lastColumn="0" w:noHBand="0" w:noVBand="1"/>
+      </w:tblPr>
+      <w:tblGrid>
+        <w:gridCol w:w="1487"/>
+        <w:gridCol w:w="3863"/>
+        <w:gridCol w:w="1266"/>
+      </w:tblGrid>
+      <w:tr>
+        <w:trPr>
+          <w:tblHeader/>
+          <w:tblCellSpacing w:w="15" w:type="dxa"/>
+        </w:trPr>
+        <w:tc>
+          <w:tcPr>
+            <w:tcW w:w="0" w:type="auto"/>
+            <w:vAlign w:val="center"/>
+            <w:hideMark/>
+          </w:tcPr>
+          <w:p>
+            <w:pPr>
+              <w:spacing w:after="0" w:line="240" w:lineRule="auto"/>
+              <w:ind w:left="360"/>
+              <w:rPr>
+                <w:b/>
+                <w:bCs/>
+                <w:noProof/>
+                <w:sz w:val="32"/>
+                <w:szCs w:val="32"/>
+                <w:lang w:val="tr-TR"/>
+              </w:rPr>
+            </w:pPr>
+            <w:r>
+              <w:rPr>
+                <w:b/>
+                <w:bCs/>
+                <w:noProof/>
+                <w:sz w:val="32"/>
+                <w:szCs w:val="32"/>
+                <w:lang w:val="tr-TR"/>
+              </w:rPr>
+              <w:t>Commit</w:t>
+            </w:r>
+          </w:p>
+        </w:tc>
+        <w:tc>
+          <w:tcPr>
+            <w:tcW w:w="0" w:type="auto"/>
+            <w:vAlign w:val="center"/>
+            <w:hideMark/>
+          </w:tcPr>
+          <w:p>
+            <w:pPr>
+              <w:spacing w:after="0" w:line="240" w:lineRule="auto"/>
+              <w:ind w:left="360"/>
+              <w:rPr>
+                <w:b/>
+                <w:bCs/>
+                <w:noProof/>
+                <w:sz w:val="32"/>
+                <w:szCs w:val="32"/>
+                <w:lang w:val="tr-TR"/>
+              </w:rPr>
+            </w:pPr>
+            <w:r>
+              <w:rPr>
+                <w:b/>
+                <w:bCs/>
+                <w:noProof/>
+                <w:sz w:val="32"/>
+                <w:szCs w:val="32"/>
+                <w:lang w:val="tr-TR"/>
+              </w:rPr>
+              <w:t>Feature</w:t>
+            </w:r>
+          </w:p>
+        </w:tc>
+        <w:tc>
+          <w:tcPr>
+            <w:tcW w:w="0" w:type="auto"/>
+            <w:vAlign w:val="center"/>
+            <w:hideMark/>
+          </w:tcPr>
+          <w:p>
+            <w:pPr>
+              <w:spacing w:after="0" w:line="240" w:lineRule="auto"/>
+              <w:ind w:left="360"/>
+              <w:rPr>
+                <w:b/>
+                <w:bCs/>
+                <w:noProof/>
+                <w:sz w:val="32"/>
+                <w:szCs w:val="32"/>
+                <w:lang w:val="tr-TR"/>
+              </w:rPr>
+            </w:pPr>
+            <w:r>
+              <w:rPr>
+                <w:b/>
+                <w:bCs/>
+                <w:noProof/>
+                <w:sz w:val="32"/>
+                <w:szCs w:val="32"/>
+                <w:lang w:val="tr-TR"/>
+              </w:rPr>
+              <w:t>Status</w:t>
+            </w:r>
+          </w:p>
+        </w:tc>
+      </w:tr>
+      <w:tr>
+        <w:trPr>
+          <w:tblCellSpacing w:w="15" w:type="dxa"/>
+        </w:trPr>
+        <w:tc>
+          <w:tcPr>
+            <w:tcW w:w="0" w:type="auto"/>
+            <w:vAlign w:val="center"/>
+            <w:hideMark/>
+          </w:tcPr>
+          <w:p>
+            <w:pPr>
+              <w:spacing w:after="0" w:line="240" w:lineRule="auto"/>
+              <w:ind w:left="360"/>
+              <w:rPr>
+                <w:noProof/>
+                <w:sz w:val="32"/>
+                <w:szCs w:val="32"/>
+                <w:lang w:val="tr-TR"/>
+              </w:rPr>
+            </w:pPr>
+            <w:r>
+              <w:rPr>
+                <w:noProof/>
+                <w:sz w:val="32"/>
+                <w:szCs w:val="32"/>
+                <w:lang w:val="tr-TR"/>
+              </w:rPr>
+              <w:t>#1</w:t>
+            </w:r>
+          </w:p>
+        </w:tc>
+        <w:tc>
+          <w:tcPr>
+            <w:tcW w:w="0" w:type="auto"/>
+            <w:vAlign w:val="center"/>
+            <w:hideMark/>
+          </w:tcPr>
+          <w:p>
+            <w:pPr>
+              <w:spacing w:after="0" w:line="240" w:lineRule="auto"/>
+              <w:ind w:left="360"/>
+              <w:rPr>
+                <w:noProof/>
+                <w:sz w:val="32"/>
+                <w:szCs w:val="32"/>
+                <w:lang w:val="tr-TR"/>
+              </w:rPr>
+            </w:pPr>
+            <w:r>
+              <w:rPr>
+                <w:noProof/>
+                <w:sz w:val="32"/>
+                <w:szCs w:val="32"/>
+                <w:lang w:val="tr-TR"/>
+              </w:rPr>
+              <w:t>BatteryDataset</w:t>
+            </w:r>
+          </w:p>
+        </w:tc>
+        <w:tc>
+          <w:tcPr>
+            <w:tcW w:w="0" w:type="auto"/>
+            <w:vAlign w:val="center"/>
+            <w:hideMark/>
+          </w:tcPr>
+          <w:p>
+            <w:pPr>
+              <w:spacing w:after="0" w:line="240" w:lineRule="auto"/>
+              <w:ind w:left="360"/>
+              <w:rPr>
+                <w:noProof/>
+                <w:sz w:val="32"/>
+                <w:szCs w:val="32"/>
+                <w:lang w:val="tr-TR"/>
+              </w:rPr>
+            </w:pPr>
+            <w:r>
+              <w:rPr>
+                <w:rFonts w:ascii="Segoe UI Emoji" w:hAnsi="Segoe UI Emoji" w:cs="Segoe UI Emoji"/>
+                <w:noProof/>
+                <w:sz w:val="32"/>
+                <w:szCs w:val="32"/>
+                <w:lang w:val="tr-TR"/>
+              </w:rPr>
+              <w:t>✅</w:t>
+            </w:r>
+          </w:p>
+        </w:tc>
+      </w:tr>
+      <w:tr>
+        <w:trPr>
+          <w:tblCellSpacing w:w="15" w:type="dxa"/>
+        </w:trPr>
+        <w:tc>
+          <w:tcPr>
+            <w:tcW w:w="0" w:type="auto"/>
+            <w:vAlign w:val="center"/>
+            <w:hideMark/>
+          </w:tcPr>
+          <w:p>
+            <w:pPr>
+              <w:spacing w:after="0" w:line="240" w:lineRule="auto"/>
+              <w:ind w:left="360"/>
+              <w:rPr>
+                <w:noProof/>
+                <w:sz w:val="32"/>
+                <w:szCs w:val="32"/>
+                <w:lang w:val="tr-TR"/>
+              </w:rPr>
+            </w:pPr>
+            <w:r>
+              <w:rPr>
+                <w:noProof/>
+                <w:sz w:val="32"/>
+                <w:szCs w:val="32"/>
+                <w:lang w:val="tr-TR"/>
+              </w:rPr>
+              <w:t>#2</w:t>
+            </w:r>
+          </w:p>
+        </w:tc>
+        <w:tc>
+          <w:tcPr>
+            <w:tcW w:w="0" w:type="auto"/>
+            <w:vAlign w:val="center"/>
+            <w:hideMark/>
+          </w:tcPr>
+          <w:p>
+            <w:pPr>
+              <w:spacing w:after="0" w:line="240" w:lineRule="auto"/>
+              <w:ind w:left="360"/>
+              <w:rPr>
+                <w:noProof/>
+                <w:sz w:val="32"/>
+                <w:szCs w:val="32"/>
+                <w:lang w:val="tr-TR"/>
+              </w:rPr>
+            </w:pPr>
+            <w:r>
+              <w:rPr>
+                <w:noProof/>
+                <w:sz w:val="32"/>
+                <w:szCs w:val="32"/>
+                <w:lang w:val="tr-TR"/>
+              </w:rPr>
+              <w:t>CSV Loader</w:t>
+            </w:r>
+          </w:p>
+        </w:tc>
+        <w:tc>
+          <w:tcPr>
+            <w:tcW w:w="0" w:type="auto"/>
+            <w:vAlign w:val="center"/>
+            <w:hideMark/>
+          </w:tcPr>
+          <w:p>
+            <w:pPr>
+              <w:spacing w:after="0" w:line="240" w:lineRule="auto"/>
+              <w:ind w:left="360"/>
+              <w:rPr>
+                <w:noProof/>
+                <w:sz w:val="32"/>
+                <w:szCs w:val="32"/>
+                <w:lang w:val="tr-TR"/>
+              </w:rPr>
+            </w:pPr>
+            <w:r>
+              <w:rPr>
+                <w:rFonts w:ascii="Segoe UI Emoji" w:hAnsi="Segoe UI Emoji" w:cs="Segoe UI Emoji"/>
+                <w:noProof/>
+                <w:sz w:val="32"/>
+                <w:szCs w:val="32"/>
+                <w:lang w:val="tr-TR"/>
+              </w:rPr>
+              <w:t>✅</w:t>
+            </w:r>
+          </w:p>
+        </w:tc>
+      </w:tr>
+      <w:tr>
+        <w:trPr>
+          <w:tblCellSpacing w:w="15" w:type="dxa"/>
+        </w:trPr>
+        <w:tc>
+          <w:tcPr>
+            <w:tcW w:w="0" w:type="auto"/>
+            <w:vAlign w:val="center"/>
+            <w:hideMark/>
+          </w:tcPr>
+          <w:p>
+            <w:pPr>
+              <w:spacing w:after="0" w:line="240" w:lineRule="auto"/>
+              <w:ind w:left="360"/>
+              <w:rPr>
+                <w:noProof/>
+                <w:sz w:val="32"/>
+                <w:szCs w:val="32"/>
+                <w:lang w:val="tr-TR"/>
+              </w:rPr>
+            </w:pPr>
+            <w:r>
+              <w:rPr>
+                <w:noProof/>
+                <w:sz w:val="32"/>
+                <w:szCs w:val="32"/>
+                <w:lang w:val="tr-TR"/>
+              </w:rPr>
+              <w:t>#3</w:t>
+            </w:r>
+          </w:p>
+        </w:tc>
+        <w:tc>
+          <w:tcPr>
+            <w:tcW w:w="0" w:type="auto"/>
+            <w:vAlign w:val="center"/>
+            <w:hideMark/>
+          </w:tcPr>
+          <w:p>
+            <w:pPr>
+              <w:spacing w:after="0" w:line="240" w:lineRule="auto"/>
+              <w:ind w:left="360"/>
+              <w:rPr>
+                <w:noProof/>
+                <w:sz w:val="32"/>
+                <w:szCs w:val="32"/>
+                <w:lang w:val="tr-TR"/>
+              </w:rPr>
+            </w:pPr>
+            <w:r>
+              <w:rPr>
+                <w:noProof/>
+                <w:sz w:val="32"/>
+                <w:szCs w:val="32"/>
+                <w:lang w:val="tr-TR"/>
+              </w:rPr>
+              <w:t>Validation Engine</w:t>
+            </w:r>
+          </w:p>
+        </w:tc>
+        <w:tc>
+          <w:tcPr>
+            <w:tcW w:w="0" w:type="auto"/>
+            <w:vAlign w:val="center"/>
+            <w:hideMark/>
+          </w:tcPr>
+          <w:p>
+            <w:pPr>
+              <w:spacing w:after="0" w:line="240" w:lineRule="auto"/>
+              <w:ind w:left="360"/>
+              <w:rPr>
+                <w:noProof/>
+                <w:sz w:val="32"/>
+                <w:szCs w:val="32"/>
+                <w:lang w:val="tr-TR"/>
+              </w:rPr>
+            </w:pPr>
+            <w:r>
+              <w:rPr>
+                <w:rFonts w:ascii="Segoe UI Emoji" w:hAnsi="Segoe UI Emoji" w:cs="Segoe UI Emoji"/>
+                <w:noProof/>
+                <w:sz w:val="32"/>
+                <w:szCs w:val="32"/>
+                <w:lang w:val="tr-TR"/>
+              </w:rPr>
+              <w:t>✅</w:t>
+            </w:r>
+          </w:p>
+        </w:tc>
+      </w:tr>
+      <w:tr>
+        <w:trPr>
+          <w:tblCellSpacing w:w="15" w:type="dxa"/>
+        </w:trPr>
+        <w:tc>
+          <w:tcPr>
+            <w:tcW w:w="0" w:type="auto"/>
+            <w:vAlign w:val="center"/>
+            <w:hideMark/>
+          </w:tcPr>
+          <w:p>
+            <w:pPr>
+              <w:spacing w:after="0" w:line="240" w:lineRule="auto"/>
+              <w:ind w:left="360"/>
+              <w:rPr>
+                <w:noProof/>
+                <w:sz w:val="32"/>
+                <w:szCs w:val="32"/>
+                <w:lang w:val="tr-TR"/>
+              </w:rPr>
+            </w:pPr>
+            <w:r>
+              <w:rPr>
+                <w:noProof/>
+                <w:sz w:val="32"/>
+                <w:szCs w:val="32"/>
+                <w:lang w:val="tr-TR"/>
+              </w:rPr>
+              <w:t>#4</w:t>
+            </w:r>
+          </w:p>
+        </w:tc>
+        <w:tc>
+          <w:tcPr>
+            <w:tcW w:w="0" w:type="auto"/>
+            <w:vAlign w:val="center"/>
+            <w:hideMark/>
+          </w:tcPr>
+          <w:p>
+            <w:pPr>
+              <w:spacing w:after="0" w:line="240" w:lineRule="auto"/>
+              <w:ind w:left="360"/>
+              <w:rPr>
+                <w:noProof/>
+                <w:sz w:val="32"/>
+                <w:szCs w:val="32"/>
+                <w:lang w:val="tr-TR"/>
+              </w:rPr>
+            </w:pPr>
+            <w:r>
+              <w:rPr>
+                <w:noProof/>
+                <w:sz w:val="32"/>
+                <w:szCs w:val="32"/>
+                <w:lang w:val="tr-TR"/>
+              </w:rPr>
+              <w:t>Missing-data interpolation</w:t>
+            </w:r>
+          </w:p>
+        </w:tc>
+        <w:tc>
+          <w:tcPr>
+            <w:tcW w:w="0" w:type="auto"/>
+            <w:vAlign w:val="center"/>
+            <w:hideMark/>
+          </w:tcPr>
+          <w:p>
+            <w:pPr>
+              <w:spacing w:after="0" w:line="240" w:lineRule="auto"/>
+              <w:ind w:left="360"/>
+              <w:rPr>
+                <w:noProof/>
+                <w:sz w:val="32"/>
+                <w:szCs w:val="32"/>
+                <w:lang w:val="tr-TR"/>
+              </w:rPr>
+            </w:pPr>
+            <w:r>
+              <w:rPr>
+                <w:rFonts w:ascii="Segoe UI Emoji" w:hAnsi="Segoe UI Emoji" w:cs="Segoe UI Emoji"/>
+                <w:noProof/>
+                <w:sz w:val="32"/>
+                <w:szCs w:val="32"/>
+                <w:lang w:val="tr-TR"/>
+              </w:rPr>
+              <w:t>✅</w:t>
+            </w:r>
+          </w:p>
+        </w:tc>
+      </w:tr>
+      <w:tr>
+        <w:trPr>
+          <w:tblCellSpacing w:w="15" w:type="dxa"/>
+        </w:trPr>
+        <w:tc>
+          <w:tcPr>
+            <w:tcW w:w="0" w:type="auto"/>
+            <w:vAlign w:val="center"/>
+            <w:hideMark/>
+          </w:tcPr>
+          <w:p>
+            <w:pPr>
+              <w:spacing w:after="0" w:line="240" w:lineRule="auto"/>
+              <w:ind w:left="360"/>
+              <w:rPr>
+                <w:noProof/>
+                <w:sz w:val="32"/>
+                <w:szCs w:val="32"/>
+                <w:lang w:val="tr-TR"/>
+              </w:rPr>
+            </w:pPr>
+            <w:r>
+              <w:rPr>
+                <w:noProof/>
+                <w:sz w:val="32"/>
+                <w:szCs w:val="32"/>
+                <w:lang w:val="tr-TR"/>
+              </w:rPr>
+              <w:t>#5</w:t>
+            </w:r>
+          </w:p>
+        </w:tc>
+        <w:tc>
+          <w:tcPr>
+            <w:tcW w:w="0" w:type="auto"/>
+            <w:vAlign w:val="center"/>
+            <w:hideMark/>
+          </w:tcPr>
+          <w:p>
+            <w:pPr>
+              <w:spacing w:after="0" w:line="240" w:lineRule="auto"/>
+              <w:ind w:left="360"/>
+              <w:rPr>
+                <w:noProof/>
+                <w:sz w:val="32"/>
+                <w:szCs w:val="32"/>
+                <w:lang w:val="tr-TR"/>
+              </w:rPr>
+            </w:pPr>
+            <w:r>
+              <w:rPr>
+                <w:noProof/>
+                <w:sz w:val="32"/>
+                <w:szCs w:val="32"/>
+                <w:lang w:val="tr-TR"/>
+              </w:rPr>
+              <w:t>Frequency detection</w:t>
+            </w:r>
+          </w:p>
+        </w:tc>
+        <w:tc>
+          <w:tcPr>
+            <w:tcW w:w="0" w:type="auto"/>
+            <w:vAlign w:val="center"/>
+            <w:hideMark/>
+          </w:tcPr>
+          <w:p>
+            <w:pPr>
+              <w:spacing w:after="0" w:line="240" w:lineRule="auto"/>
+              <w:ind w:left="360"/>
+              <w:rPr>
+                <w:noProof/>
+                <w:sz w:val="32"/>
+                <w:szCs w:val="32"/>
+                <w:lang w:val="tr-TR"/>
+              </w:rPr>
+            </w:pPr>
+            <w:r>
+              <w:rPr>
+                <w:rFonts w:ascii="Segoe UI Emoji" w:hAnsi="Segoe UI Emoji" w:cs="Segoe UI Emoji"/>
+                <w:noProof/>
+                <w:sz w:val="32"/>
+                <w:szCs w:val="32"/>
+                <w:lang w:val="tr-TR"/>
+              </w:rPr>
+              <w:t>✅</w:t>
+            </w:r>
+          </w:p>
+        </w:tc>
+      </w:tr>
+      <w:tr>
+        <w:trPr>
+          <w:tblCellSpacing w:w="15" w:type="dxa"/>
+        </w:trPr>
+        <w:tc>
+          <w:tcPr>
+            <w:tcW w:w="0" w:type="auto"/>
+            <w:vAlign w:val="center"/>
+            <w:hideMark/>
+          </w:tcPr>
+          <w:p>
+            <w:pPr>
+              <w:spacing w:after="0" w:line="240" w:lineRule="auto"/>
+              <w:ind w:left="360"/>
+              <w:rPr>
+                <w:noProof/>
+                <w:sz w:val="32"/>
+                <w:szCs w:val="32"/>
+                <w:lang w:val="tr-TR"/>
+              </w:rPr>
+            </w:pPr>
+            <w:r>
+              <w:rPr>
+                <w:noProof/>
+                <w:sz w:val="32"/>
+                <w:szCs w:val="32"/>
+                <w:lang w:val="tr-TR"/>
+              </w:rPr>
+              <w:t>#6</w:t>
+            </w:r>
+          </w:p>
+        </w:tc>
+        <w:tc>
+          <w:tcPr>
+            <w:tcW w:w="0" w:type="auto"/>
+            <w:vAlign w:val="center"/>
+            <w:hideMark/>
+          </w:tcPr>
+          <w:p>
+            <w:pPr>
+              <w:spacing w:after="0" w:line="240" w:lineRule="auto"/>
+              <w:ind w:left="360"/>
+              <w:rPr>
+                <w:noProof/>
+                <w:sz w:val="32"/>
+                <w:szCs w:val="32"/>
+                <w:lang w:val="tr-TR"/>
+              </w:rPr>
+            </w:pPr>
+            <w:r>
+              <w:rPr>
+                <w:noProof/>
+                <w:sz w:val="32"/>
+                <w:szCs w:val="32"/>
+                <w:lang w:val="tr-TR"/>
+              </w:rPr>
+              <w:t>Missing-period detection</w:t>
+            </w:r>
+          </w:p>
+        </w:tc>
+        <w:tc>
+          <w:tcPr>
+            <w:tcW w:w="0" w:type="auto"/>
+            <w:vAlign w:val="center"/>
+            <w:hideMark/>
+          </w:tcPr>
+          <w:p>
+            <w:pPr>
+              <w:spacing w:after="0" w:line="240" w:lineRule="auto"/>
+              <w:ind w:left="360"/>
+              <w:rPr>
+                <w:noProof/>
+                <w:sz w:val="32"/>
+                <w:szCs w:val="32"/>
+                <w:lang w:val="tr-TR"/>
+              </w:rPr>
+            </w:pPr>
+            <w:r>
+              <w:rPr>
+                <w:rFonts w:ascii="Segoe UI Emoji" w:hAnsi="Segoe UI Emoji" w:cs="Segoe UI Emoji"/>
+                <w:noProof/>
+                <w:sz w:val="32"/>
+                <w:szCs w:val="32"/>
+                <w:lang w:val="tr-TR"/>
+              </w:rPr>
+              <w:t>✅</w:t>
+            </w:r>
+          </w:p>
+        </w:tc>
+      </w:tr>
+      <w:tr>
+        <w:trPr>
+          <w:tblCellSpacing w:w="15" w:type="dxa"/>
+        </w:trPr>
+        <w:tc>
+          <w:tcPr>
+            <w:tcW w:w="0" w:type="auto"/>
+            <w:vAlign w:val="center"/>
+            <w:hideMark/>
+          </w:tcPr>
+          <w:p>
+            <w:pPr>
+              <w:spacing w:after="0" w:line="240" w:lineRule="auto"/>
+              <w:ind w:left="360"/>
+              <w:rPr>
+                <w:noProof/>
+                <w:sz w:val="32"/>
+                <w:szCs w:val="32"/>
+                <w:lang w:val="tr-TR"/>
+              </w:rPr>
+            </w:pPr>
+            <w:r>
+              <w:rPr>
+                <w:noProof/>
+                <w:sz w:val="32"/>
+                <w:szCs w:val="32"/>
+                <w:lang w:val="tr-TR"/>
+              </w:rPr>
+              <w:t>#7</w:t>
+            </w:r>
+          </w:p>
+        </w:tc>
+        <w:tc>
+          <w:tcPr>
+            <w:tcW w:w="0" w:type="auto"/>
+            <w:vAlign w:val="center"/>
+            <w:hideMark/>
+          </w:tcPr>
+          <w:p>
+            <w:pPr>
+              <w:spacing w:after="0" w:line="240" w:lineRule="auto"/>
+              <w:ind w:left="360"/>
+              <w:rPr>
+                <w:noProof/>
+                <w:sz w:val="32"/>
+                <w:szCs w:val="32"/>
+                <w:lang w:val="tr-TR"/>
+              </w:rPr>
+            </w:pPr>
+            <w:r>
+              <w:rPr>
+                <w:noProof/>
+                <w:sz w:val="32"/>
+                <w:szCs w:val="32"/>
+                <w:lang w:val="tr-TR"/>
+              </w:rPr>
+              <w:t>Data cleaning</w:t>
+            </w:r>
+          </w:p>
+        </w:tc>
+        <w:tc>
+          <w:tcPr>
+            <w:tcW w:w="0" w:type="auto"/>
+            <w:vAlign w:val="center"/>
+            <w:hideMark/>
+          </w:tcPr>
+          <w:p>
+            <w:pPr>
+              <w:spacing w:after="0" w:line="240" w:lineRule="auto"/>
+              <w:ind w:left="360"/>
+              <w:rPr>
+                <w:noProof/>
+                <w:sz w:val="32"/>
+                <w:szCs w:val="32"/>
+                <w:lang w:val="tr-TR"/>
+              </w:rPr>
+            </w:pPr>
+            <w:r>
+              <w:rPr>
+                <w:rFonts w:ascii="Segoe UI Emoji" w:hAnsi="Segoe UI Emoji" w:cs="Segoe UI Emoji"/>
+                <w:noProof/>
+                <w:sz w:val="32"/>
+                <w:szCs w:val="32"/>
+                <w:lang w:val="tr-TR"/>
+              </w:rPr>
+              <w:t>✅</w:t>
+            </w:r>
+          </w:p>
+        </w:tc>
+      </w:tr>
+      <w:tr>
+        <w:trPr>
+          <w:tblCellSpacing w:w="15" w:type="dxa"/>
+        </w:trPr>
+        <w:tc>
+          <w:tcPr>
+            <w:tcW w:w="0" w:type="auto"/>
+            <w:vAlign w:val="center"/>
+            <w:hideMark/>
+          </w:tcPr>
+          <w:p>
+            <w:pPr>
+              <w:spacing w:after="0" w:line="240" w:lineRule="auto"/>
+              <w:ind w:left="360"/>
+              <w:rPr>
+                <w:noProof/>
+                <w:sz w:val="32"/>
+                <w:szCs w:val="32"/>
+                <w:lang w:val="tr-TR"/>
+              </w:rPr>
+            </w:pPr>
+            <w:r>
+              <w:rPr>
+                <w:noProof/>
+                <w:sz w:val="32"/>
+                <w:szCs w:val="32"/>
+                <w:lang w:val="tr-TR"/>
+              </w:rPr>
+              <w:t>#8</w:t>
+            </w:r>
+          </w:p>
+        </w:tc>
+        <w:tc>
+          <w:tcPr>
+            <w:tcW w:w="0" w:type="auto"/>
+            <w:vAlign w:val="center"/>
+            <w:hideMark/>
+          </w:tcPr>
+          <w:p>
+            <w:pPr>
+              <w:spacing w:after="0" w:line="240" w:lineRule="auto"/>
+              <w:ind w:left="360"/>
+              <w:rPr>
+                <w:noProof/>
+                <w:sz w:val="32"/>
+                <w:szCs w:val="32"/>
+                <w:lang w:val="tr-TR"/>
+              </w:rPr>
+            </w:pPr>
+            <w:r>
+              <w:rPr>
+                <w:noProof/>
+                <w:sz w:val="32"/>
+                <w:szCs w:val="32"/>
+                <w:lang w:val="tr-TR"/>
+              </w:rPr>
+              <w:t>Dataset diagnostics report</w:t>
+            </w:r>
+          </w:p>
+        </w:tc>
+        <w:tc>
+          <w:tcPr>
+            <w:tcW w:w="0" w:type="auto"/>
+            <w:vAlign w:val="center"/>
+            <w:hideMark/>
+          </w:tcPr>
+          <w:p>
+            <w:pPr>
+              <w:spacing w:after="0" w:line="240" w:lineRule="auto"/>
+              <w:ind w:left="360"/>
+              <w:rPr>
+                <w:noProof/>
+                <w:sz w:val="32"/>
+                <w:szCs w:val="32"/>
+                <w:lang w:val="tr-TR"/>
+              </w:rPr>
+            </w:pPr>
+            <w:r>
+              <w:rPr>
+                <w:rFonts w:ascii="Segoe UI Emoji" w:hAnsi="Segoe UI Emoji" w:cs="Segoe UI Emoji"/>
+                <w:noProof/>
+                <w:sz w:val="32"/>
+                <w:szCs w:val="32"/>
+                <w:lang w:val="tr-TR"/>
+              </w:rPr>
+              <w:t>🚀</w:t>
+            </w:r>
+          </w:p>
+        </w:tc>
+      </w:tr>
+    </w:tbl>
+    <w:p>
+      <w:pPr>
+        <w:spacing w:after="0" w:line="240" w:lineRule="auto"/>
+        <w:ind w:left="360"/>
+        <w:rPr>
+          <w:noProof/>
+          <w:sz w:val="32"/>
+          <w:szCs w:val="32"/>
+          <w:lang w:val="tr-TR"/>
+        </w:rPr>
+      </w:pPr>
     </w:p>
     <w:p>
       <w:pPr>

</xml_diff>